<commit_message>
Fix more xml character issues (#9)
</commit_message>
<xml_diff>
--- a/src/OpenXmlHtml.Tests/Samples/WordSamples.ConvertFileToDocx.DotNet.verified.docx
+++ b/src/OpenXmlHtml.Tests/Samples/WordSamples.ConvertFileToDocx.DotNet.verified.docx
@@ -18,6 +18,10 @@
         <w:t xml:space="preserve">World</w:t>
       </w:r>
     </w:p>
+    <w:sectPr>
+      <w:pgSz w:w="11906" w:h="16838"/>
+      <w:pgMar w:top="1440" w:right="1440" w:bottom="1440" w:left="1440" w:header="720" w:footer="720" w:gutter="0"/>
+    </w:sectPr>
   </w:body>
 </w:document>
 </file>
</xml_diff>